<commit_message>
machine learning report part
</commit_message>
<xml_diff>
--- a/Report/Design_Report.docx
+++ b/Report/Design_Report.docx
@@ -1278,7 +1278,7 @@
           <w:noProof/>
         </w:rPr>
         <w:drawing>
-          <wp:anchor distT="0" distB="0" distL="114300" distR="114300" simplePos="0" relativeHeight="251660288" behindDoc="0" locked="0" layoutInCell="1" allowOverlap="1" wp14:anchorId="474BB9E4" wp14:editId="449FB1F1">
+          <wp:anchor distT="0" distB="0" distL="114300" distR="114300" simplePos="0" relativeHeight="251660288" behindDoc="0" locked="0" layoutInCell="1" allowOverlap="1" wp14:anchorId="474BB9E4" wp14:editId="20D1B89B">
             <wp:simplePos x="0" y="0"/>
             <wp:positionH relativeFrom="column">
               <wp:posOffset>1174750</wp:posOffset>
@@ -5238,18 +5238,49 @@
         <w:pStyle w:val="Heading1"/>
       </w:pPr>
       <w:r>
+        <w:t>Machine Learning Part</w:t>
+      </w:r>
+    </w:p>
+    <w:p>
+      <w:r>
+        <w:t>Our machine learning feature is a simple subject clustering system built into the app. It takes the subject data from the database and groups similar subjects together into categories.</w:t>
+      </w:r>
+    </w:p>
+    <w:p>
+      <w:r>
+        <w:t xml:space="preserve">Instead of using a complex model, we used a lightweight approach where the system looks at keywords in each subject name. For example, subjects that contain words like “programming” are grouped under Programming, “web” goes under Web Development, and topics like “machine learning” or “AI” are grouped under Artificial Intelligence. Business and </w:t>
+      </w:r>
+      <w:proofErr w:type="spellStart"/>
+      <w:r>
+        <w:t>maths</w:t>
+      </w:r>
+      <w:proofErr w:type="spellEnd"/>
+      <w:r>
+        <w:t>-related subjects are also grouped in a similar way.</w:t>
+      </w:r>
+    </w:p>
+    <w:p>
+      <w:r>
+        <w:t>We chose this method because it is simple, fast to implement, and works well with a small dataset like ours. It also clearly shows how data can be processed and turned into useful insights inside an application.</w:t>
+      </w:r>
+    </w:p>
+    <w:p>
+      <w:r>
+        <w:t>The feature is fully integrated into the app as a page, so users can view how subjects are grouped in real time.</w:t>
+      </w:r>
+    </w:p>
+    <w:p>
+      <w:pPr>
+        <w:pStyle w:val="Heading1"/>
+      </w:pPr>
+      <w:r>
+        <w:lastRenderedPageBreak/>
         <w:t>Conclusion</w:t>
       </w:r>
     </w:p>
     <w:p>
       <w:r>
-        <w:t xml:space="preserve">Finally, our goal is to have a simple, functional and reliable application that does not overwhelm first year students but helps them adjust to their new academic life, and to make campus services easy to reach, aligning with </w:t>
-      </w:r>
-      <w:r>
-        <w:t xml:space="preserve">GDPR </w:t>
-      </w:r>
-      <w:r>
-        <w:t>basics and data minimization to keep it trustable, private and functional.</w:t>
+        <w:t>Finally, our goal is to have a simple, functional and reliable application that does not overwhelm first year students but helps them adjust to their new academic life, and to make campus services easy to reach, aligning with GDPR basics and data minimization to keep it trustable, private and functional.</w:t>
       </w:r>
     </w:p>
     <w:sectPr>
@@ -7307,6 +7338,15 @@
 </file>
 
 <file path=customXml/item2.xml><?xml version="1.0" encoding="utf-8"?>
+<?mso-contentType ?>
+<FormTemplates xmlns="http://schemas.microsoft.com/sharepoint/v3/contenttype/forms">
+  <Display>DocumentLibraryForm</Display>
+  <Edit>DocumentLibraryForm</Edit>
+  <New>DocumentLibraryForm</New>
+</FormTemplates>
+</file>
+
+<file path=customXml/item3.xml><?xml version="1.0" encoding="utf-8"?>
 <ct:contentTypeSchema xmlns:ct="http://schemas.microsoft.com/office/2006/metadata/contentType" xmlns:ma="http://schemas.microsoft.com/office/2006/metadata/properties/metaAttributes" ct:_="" ma:_="" ma:contentTypeName="Document" ma:contentTypeID="0x01010079F111ED35F8CC479449609E8A0923A6" ma:contentTypeVersion="26" ma:contentTypeDescription="Create a new document." ma:contentTypeScope="" ma:versionID="ac37c1753acd5e330d2062ccec26ea66">
   <xsd:schema xmlns:xsd="http://www.w3.org/2001/XMLSchema" xmlns:xs="http://www.w3.org/2001/XMLSchema" xmlns:p="http://schemas.microsoft.com/office/2006/metadata/properties" xmlns:ns1="http://schemas.microsoft.com/sharepoint/v3" xmlns:ns2="71af3243-3dd4-4a8d-8c0d-dd76da1f02a5" xmlns:ns3="16c05727-aa75-4e4a-9b5f-8a80a1165891" xmlns:ns4="230e9df3-be65-4c73-a93b-d1236ebd677e" targetNamespace="http://schemas.microsoft.com/office/2006/metadata/properties" ma:root="true" ma:fieldsID="3b340c7101c92c5120abd06486f94548" ns1:_="" ns2:_="" ns3:_="" ns4:_="">
     <xsd:import namespace="http://schemas.microsoft.com/sharepoint/v3"/>
@@ -7606,15 +7646,6 @@
 </ct:contentTypeSchema>
 </file>
 
-<file path=customXml/item3.xml><?xml version="1.0" encoding="utf-8"?>
-<?mso-contentType ?>
-<FormTemplates xmlns="http://schemas.microsoft.com/sharepoint/v3/contenttype/forms">
-  <Display>DocumentLibraryForm</Display>
-  <Edit>DocumentLibraryForm</Edit>
-  <New>DocumentLibraryForm</New>
-</FormTemplates>
-</file>
-
 <file path=customXml/itemProps1.xml><?xml version="1.0" encoding="utf-8"?>
 <ds:datastoreItem xmlns:ds="http://schemas.openxmlformats.org/officeDocument/2006/customXml" ds:itemID="{C7DCE20C-610A-4626-841D-1F10857B445E}">
   <ds:schemaRefs>
@@ -7628,6 +7659,14 @@
 </file>
 
 <file path=customXml/itemProps2.xml><?xml version="1.0" encoding="utf-8"?>
+<ds:datastoreItem xmlns:ds="http://schemas.openxmlformats.org/officeDocument/2006/customXml" ds:itemID="{2D686CB8-6245-413C-A355-156513A377FC}">
+  <ds:schemaRefs>
+    <ds:schemaRef ds:uri="http://schemas.microsoft.com/sharepoint/v3/contenttype/forms"/>
+  </ds:schemaRefs>
+</ds:datastoreItem>
+</file>
+
+<file path=customXml/itemProps3.xml><?xml version="1.0" encoding="utf-8"?>
 <ds:datastoreItem xmlns:ds="http://schemas.openxmlformats.org/officeDocument/2006/customXml" ds:itemID="{3B411A11-DDA3-4BC4-B0BC-14026E6D5DF4}">
   <ds:schemaRefs>
     <ds:schemaRef ds:uri="http://schemas.microsoft.com/office/2006/metadata/contentType"/>
@@ -7646,12 +7685,4 @@
     <ds:schemaRef ds:uri="http://schemas.microsoft.com/internal/obd"/>
   </ds:schemaRefs>
 </ds:datastoreItem>
-</file>
-
-<file path=customXml/itemProps3.xml><?xml version="1.0" encoding="utf-8"?>
-<ds:datastoreItem xmlns:ds="http://schemas.openxmlformats.org/officeDocument/2006/customXml" ds:itemID="{2D686CB8-6245-413C-A355-156513A377FC}">
-  <ds:schemaRefs>
-    <ds:schemaRef ds:uri="http://schemas.microsoft.com/sharepoint/v3/contenttype/forms"/>
-  </ds:schemaRefs>
-</ds:datastoreItem>
 </file>
</xml_diff>